<commit_message>
fix:changes about models in the srs
</commit_message>
<xml_diff>
--- a/docs/srs.docx
+++ b/docs/srs.docx
@@ -1666,7 +1666,7 @@
           <w:sz w:val="20"/>
           <w:szCs w:val="20"/>
         </w:rPr>
-        <w:t>Para responder a esta necesidad, proponemos una aplicación móvil que traduce señas en tiempo real mediante la cámara del dispositivo. Además, permite expresar frases en lengua de señas a través de un modelo 3D interactivo, facilitando la comunicación en ambos sentidos.</w:t>
+        <w:t>Para responder a esta necesidad, proponemos una aplicación móvil que traduce señas a texto y voz en tiempo real mediante la cámara del dispositivo, facilitando la comunicación con personas oyentes.</w:t>
       </w:r>
     </w:p>
     <w:p>
@@ -1752,7 +1752,7 @@
           <w:sz w:val="20"/>
           <w:szCs w:val="20"/>
         </w:rPr>
-        <w:t>Ante esta situación, se identifica la necesidad urgente de desarrollar una solución tecnológica que permita traducir el lenguaje de señas de forma automatizada y accesible. Este proyecto propone una aplicación móvil basada en visión por computadora e inteligencia artificial, capaz de reconocer señas en tiempo real y enseñar su expresión mediante un modelo 3D interactivo, promoviendo así una comunicación equitativa y más inclusiva.</w:t>
+        <w:t>Ante esta situación, se identifica la necesidad urgente de desarrollar una solución tecnológica que permita traducir el lenguaje de señas de forma automatizada y accesible. Este proyecto propone una aplicación móvil basada en visión por computadora e inteligencia artificial, capaz de reconocer señas en tiempo real y traducirlas a texto y voz, promoviendo así una comunicación equitativa y más inclusiva.</w:t>
       </w:r>
     </w:p>
     <w:p>
@@ -1812,7 +1812,7 @@
           <w:sz w:val="20"/>
           <w:szCs w:val="20"/>
         </w:rPr>
-        <w:t xml:space="preserve">El propósito principal de este proyecto es desarrollar una aplicación móvil que facilite la comunicación bidireccional entre personas sordas y oyentes mediante la traducción automática del lenguaje de señas, utilizando tecnologías de visión por </w:t>
+        <w:t>El propósito principal de este proyecto es desarrollar una aplicación móvil que facilite la comunicación entre personas sordas y oyentes mediante la traducción automática del lenguaje de señas a texto y voz, utilizando tecnologías de visión por computadora e inteligencia artificial.</w:t>
       </w:r>
       <w:proofErr w:type="gramStart"/>
       <w:r>
@@ -1820,7 +1820,6 @@
           <w:sz w:val="20"/>
           <w:szCs w:val="20"/>
         </w:rPr>
-        <w:t>computadora,  y</w:t>
       </w:r>
       <w:proofErr w:type="gramEnd"/>
       <w:r>
@@ -1828,7 +1827,6 @@
           <w:sz w:val="20"/>
           <w:szCs w:val="20"/>
         </w:rPr>
-        <w:t xml:space="preserve"> modelado 3D.</w:t>
       </w:r>
     </w:p>
     <w:p>
@@ -1931,15 +1929,13 @@
           <w:sz w:val="20"/>
           <w:szCs w:val="20"/>
         </w:rPr>
-        <w:t xml:space="preserve">Diseñar e implementar un sistema interactivo que permita la traducción básica del lenguaje de señas a estudiantes y docentes, utilizando recursos digitales y tecnologías accesibles, con el propósito de fomentar la inclusión de personas sordas en entornos escolares y promover la </w:t>
+        <w:t>Diseñar e implementar una aplicación móvil que permita la traducción del lenguaje de señas a texto o audio en tiempo real, utilizando visión por computadora e inteligencia artificial, con el propósito de reducir las barreras de comunicación que enfrentan las personas sordas en entornos cotidianos.</w:t>
       </w:r>
       <w:r>
         <w:rPr>
           <w:sz w:val="20"/>
           <w:szCs w:val="20"/>
         </w:rPr>
-        <w:lastRenderedPageBreak/>
-        <w:t>conciencia lingüística y cultural sobre la comunidad sorda.</w:t>
       </w:r>
     </w:p>
     <w:p>
@@ -2138,7 +2134,56 @@
           <w:sz w:val="24"/>
           <w:szCs w:val="24"/>
         </w:rPr>
-        <w:t>1.6 Personal Involucrado.</w:t>
+        <w:t>1.6 Alcance</w:t>
+      </w:r>
+    </w:p>
+    <w:p>
+      <w:pPr>
+        <w:rPr>
+          <w:sz w:val="20"/>
+          <w:szCs w:val="20"/>
+        </w:rPr>
+      </w:pPr>
+      <w:r>
+        <w:rPr>
+          <w:sz w:val="20"/>
+          <w:szCs w:val="20"/>
+        </w:rPr>
+        <w:t>El sistema comprende una aplicación móvil para Android e iOS que reconoce señas mediante la cámara del dispositivo y entrega la traducción en texto o audio. Incluye gestión de cuentas de usuario, historial de traducciones, consulta del alfabeto en lengua de señas, notificaciones en pantalla y un módulo de estadísticas de uso restringido al administrador.</w:t>
+      </w:r>
+    </w:p>
+    <w:p>
+      <w:pPr>
+        <w:rPr>
+          <w:sz w:val="20"/>
+          <w:szCs w:val="20"/>
+        </w:rPr>
+      </w:pPr>
+      <w:r>
+        <w:rPr>
+          <w:sz w:val="20"/>
+          <w:szCs w:val="20"/>
+        </w:rPr>
+        <w:t>Queda fuera del alcance de esta versión: la traducción en sentido inverso (de texto o voz hacia señas), la representación mediante avatar tridimensional, la cobertura completa del vocabulario de la Lengua de Señas Colombiana y el uso sin conexión a internet.</w:t>
+      </w:r>
+    </w:p>
+    <w:p>
+      <w:pPr>
+        <w:rPr>
+          <w:b/>
+          <w:bCs/>
+          <w:sz w:val="24"/>
+          <w:szCs w:val="24"/>
+        </w:rPr>
+      </w:pPr>
+      <w:r>
+        <w:rPr>
+          <w:b/>
+          <w:bCs/>
+          <w:sz w:val="24"/>
+          <w:szCs w:val="24"/>
+        </w:rPr>
+        <w:t>1.7 Personal Involucrado.</w:t>
       </w:r>
     </w:p>
     <w:p>
@@ -2470,18 +2515,8 @@
             </w:tcBorders>
           </w:tcPr>
           <w:p>
-            <w:pPr>
-              <w:rPr>
-                <w:sz w:val="20"/>
-                <w:szCs w:val="20"/>
-              </w:rPr>
-            </w:pPr>
-            <w:r>
-              <w:rPr>
-                <w:sz w:val="20"/>
-                <w:szCs w:val="20"/>
-              </w:rPr>
-              <w:t>suazasolorzano@gamil.com</w:t>
+            <w:r>
+              <w:t>suazasolorzano@gmail.com</w:t>
             </w:r>
           </w:p>
         </w:tc>
@@ -3186,7 +3221,7 @@
           <w:sz w:val="24"/>
           <w:szCs w:val="24"/>
         </w:rPr>
-        <w:t>1.7  Definiciones</w:t>
+        <w:t>1.8  Definiciones</w:t>
       </w:r>
       <w:proofErr w:type="gramEnd"/>
       <w:r>
@@ -3711,6 +3746,25 @@
         </w:rPr>
       </w:pPr>
     </w:p>
+    <w:p>
+      <w:pPr>
+        <w:rPr>
+          <w:b/>
+          <w:bCs/>
+          <w:sz w:val="24"/>
+          <w:szCs w:val="24"/>
+        </w:rPr>
+      </w:pPr>
+      <w:r>
+        <w:rPr>
+          <w:b/>
+          <w:bCs/>
+          <w:sz w:val="24"/>
+          <w:szCs w:val="24"/>
+        </w:rPr>
+        <w:t>1.9 Referencias</w:t>
+      </w:r>
+    </w:p>
     <w:tbl>
       <w:tblPr>
         <w:tblStyle w:val="afffffa"/>
@@ -3855,6 +3909,28 @@
           </w:p>
         </w:tc>
       </w:tr>
+      <w:tr>
+        <w:tc>
+          <w:tcPr>
+            <w:tcW w:type="dxa" w:w="2413"/>
+          </w:tcPr>
+          <w:p>
+            <w:r>
+              <w:t>Ley 1581 de 2012 - Protección de Datos Personales</w:t>
+            </w:r>
+          </w:p>
+        </w:tc>
+        <w:tc>
+          <w:tcPr>
+            <w:tcW w:type="dxa" w:w="3517"/>
+          </w:tcPr>
+          <w:p>
+            <w:r>
+              <w:t>Congreso de Colombia</w:t>
+            </w:r>
+          </w:p>
+        </w:tc>
+      </w:tr>
     </w:tbl>
     <w:p>
       <w:pPr>
@@ -3882,7 +3958,7 @@
           <w:sz w:val="24"/>
           <w:szCs w:val="24"/>
         </w:rPr>
-        <w:t>1.8 Resumen General.</w:t>
+        <w:t>1.10 Resumen General.</w:t>
       </w:r>
     </w:p>
     <w:p>
@@ -3938,7 +4014,7 @@
           <w:sz w:val="20"/>
           <w:szCs w:val="20"/>
         </w:rPr>
-        <w:t xml:space="preserve">La app funcionará de manera </w:t>
+        <w:t>La app traducirá en tiempo real los gestos captados por la cámara del dispositivo a texto o voz. Esto se logrará mediante tecnologías como inteligencia artificial y visión por computadora. Adicionalmente, se evaluará la viabilidad de incluir un módulo de modelado 3D limitado a la representación del alfabeto en lengua de señas; si su desarrollo resulta demasiado complejo o lento, esta funcionalidad será descartada.</w:t>
       </w:r>
       <w:r>
         <w:rPr>
@@ -3947,14 +4023,12 @@
           <w:sz w:val="20"/>
           <w:szCs w:val="20"/>
         </w:rPr>
-        <w:t>bidireccional</w:t>
       </w:r>
       <w:r>
         <w:rPr>
           <w:sz w:val="20"/>
           <w:szCs w:val="20"/>
         </w:rPr>
-        <w:t xml:space="preserve">: permitirá traducir los gestos captados por la cámara del dispositivo a texto o voz, y también convertirá mensajes escritos u orales en lenguaje de señas mediante un </w:t>
       </w:r>
       <w:r>
         <w:rPr>
@@ -3963,14 +4037,12 @@
           <w:sz w:val="20"/>
           <w:szCs w:val="20"/>
         </w:rPr>
-        <w:t>modelo 3D animado</w:t>
       </w:r>
       <w:r>
         <w:rPr>
           <w:sz w:val="20"/>
           <w:szCs w:val="20"/>
         </w:rPr>
-        <w:t xml:space="preserve">. Esto se logrará mediante tecnologías como </w:t>
       </w:r>
       <w:r>
         <w:rPr>
@@ -3979,14 +4051,12 @@
           <w:sz w:val="20"/>
           <w:szCs w:val="20"/>
         </w:rPr>
-        <w:t>inteligencia artificial, visión por computadora y modelado 3D</w:t>
       </w:r>
       <w:r>
         <w:rPr>
           <w:sz w:val="20"/>
           <w:szCs w:val="20"/>
         </w:rPr>
-        <w:t>.</w:t>
       </w:r>
     </w:p>
     <w:p>
@@ -4001,7 +4071,7 @@
           <w:sz w:val="20"/>
           <w:szCs w:val="20"/>
         </w:rPr>
-        <w:t xml:space="preserve">El objetivo general del proyecto es diseñar un </w:t>
+        <w:t>El objetivo general del proyecto es diseñar una aplicación móvil que permita la traducción del lenguaje de señas a texto o audio en tiempo real, reduciendo las barreras de comunicación que enfrentan las personas sordas en entornos cotidianos. Entre los objetivos específicos destacan el desarrollo de la herramienta de traducción, su validación en escenarios reales y su contribución a una sociedad más inclusiva.</w:t>
       </w:r>
       <w:r>
         <w:rPr>
@@ -4010,14 +4080,12 @@
           <w:sz w:val="20"/>
           <w:szCs w:val="20"/>
         </w:rPr>
-        <w:t>sistema educativo e interactivo</w:t>
       </w:r>
       <w:r>
         <w:rPr>
           <w:sz w:val="20"/>
           <w:szCs w:val="20"/>
         </w:rPr>
-        <w:t xml:space="preserve"> que permita la enseñanza y traducción básica del lenguaje de señas en entornos escolares, fomentando la inclusión y el reconocimiento de la comunidad sorda. Entre los objetivos específicos destacan el desarrollo de la herramienta de traducción, su validación en escenarios reales y su contribución a una sociedad más inclusiva.</w:t>
       </w:r>
     </w:p>
     <w:p>
@@ -4136,7 +4204,7 @@
           <w:sz w:val="20"/>
           <w:szCs w:val="20"/>
         </w:rPr>
-        <w:t>La aplicación Signa busca mejorar la comunicación entre personas sordas/mudas y oyentes mediante una herramienta que traduce en tiempo real el lenguaje de señas a texto o voz. Está diseñada para ser educativa, accesible y fácil de usar, permitiendo que cualquier persona, incluso sin conocimientos previos, pueda interactuar con la comunidad sorda. Con esto, se pretende reducir las barreras comunicativas en espacios como la escuela, el trabajo o los servicios públicos. Signa promueve la inclusión social y responde a la gran diferencia entre la cantidad de personas sordas y el bajo número de intérpretes disponibles en Colombia.</w:t>
+        <w:t>La aplicación Traduce Señas busca mejorar la comunicación entre personas sordas/mudas y oyentes mediante una herramienta que traduce en tiempo real el lenguaje de señas a texto o voz. Está diseñada para ser educativa, accesible y fácil de usar, permitiendo que cualquier persona, incluso sin conocimientos previos, pueda interactuar con la comunidad sorda. Con esto, se pretende reducir las barreras comunicativas en espacios como la escuela, el trabajo o los servicios públicos. Traduce Señas promueve la inclusión social y responde a la gran diferencia entre la cantidad de personas sordas y el bajo número de intérpretes disponibles en Colombia.</w:t>
       </w:r>
     </w:p>
     <w:p>
@@ -4235,19 +4303,7 @@
             </w:tcBorders>
           </w:tcPr>
           <w:p>
-            <w:pPr>
-              <w:rPr>
-                <w:b/>
-                <w:bCs/>
-                <w:sz w:val="20"/>
-                <w:szCs w:val="20"/>
-              </w:rPr>
-            </w:pPr>
-            <w:r>
-              <w:rPr>
-                <w:sz w:val="20"/>
-                <w:szCs w:val="20"/>
-              </w:rPr>
+            <w:r>
               <w:t>Nombre de usuario:</w:t>
             </w:r>
           </w:p>
@@ -4263,20 +4319,8 @@
             </w:tcBorders>
           </w:tcPr>
           <w:p>
-            <w:pPr>
-              <w:rPr>
-                <w:b/>
-                <w:bCs/>
-                <w:sz w:val="20"/>
-                <w:szCs w:val="20"/>
-              </w:rPr>
-            </w:pPr>
-            <w:r>
-              <w:rPr>
-                <w:sz w:val="20"/>
-                <w:szCs w:val="20"/>
-              </w:rPr>
-              <w:t>Administrador</w:t>
+            <w:r>
+              <w:t>Usuario final</w:t>
             </w:r>
           </w:p>
         </w:tc>
@@ -4296,19 +4340,7 @@
             </w:tcBorders>
           </w:tcPr>
           <w:p>
-            <w:pPr>
-              <w:rPr>
-                <w:b/>
-                <w:bCs/>
-                <w:sz w:val="20"/>
-                <w:szCs w:val="20"/>
-              </w:rPr>
-            </w:pPr>
-            <w:r>
-              <w:rPr>
-                <w:sz w:val="20"/>
-                <w:szCs w:val="20"/>
-              </w:rPr>
+            <w:r>
               <w:t>Formación:</w:t>
             </w:r>
           </w:p>
@@ -4324,20 +4356,8 @@
             </w:tcBorders>
           </w:tcPr>
           <w:p>
-            <w:pPr>
-              <w:rPr>
-                <w:b/>
-                <w:bCs/>
-                <w:sz w:val="20"/>
-                <w:szCs w:val="20"/>
-              </w:rPr>
-            </w:pPr>
-            <w:r>
-              <w:rPr>
-                <w:sz w:val="20"/>
-                <w:szCs w:val="20"/>
-              </w:rPr>
-              <w:t>Tecnólogo en análisis y desarrollo de software</w:t>
+            <w:r>
+              <w:t>No se requiere formación técnica ni conocimiento previo de lengua de señas.</w:t>
             </w:r>
           </w:p>
         </w:tc>
@@ -4357,20 +4377,7 @@
             </w:tcBorders>
           </w:tcPr>
           <w:p>
-            <w:pPr>
-              <w:rPr>
-                <w:b/>
-                <w:bCs/>
-                <w:sz w:val="20"/>
-                <w:szCs w:val="20"/>
-              </w:rPr>
-            </w:pPr>
-            <w:r>
-              <w:rPr>
-                <w:sz w:val="20"/>
-                <w:szCs w:val="20"/>
-              </w:rPr>
-              <w:lastRenderedPageBreak/>
+            <w:r>
               <w:t>Actividades:</w:t>
             </w:r>
           </w:p>
@@ -4386,6 +4393,199 @@
             </w:tcBorders>
           </w:tcPr>
           <w:p>
+            <w:r>
+              <w:t>Utiliza la aplicación para traducir señas a texto o audio en situaciones cotidianas, consulta su historial de traducciones, revisa el alfabeto en lengua de señas y configura sus preferencias de tema e idioma.</w:t>
+            </w:r>
+          </w:p>
+        </w:tc>
+      </w:tr>
+    </w:tbl>
+    <w:tbl>
+      <w:tblPr>
+        <w:tblStyle w:val="afffffb"/>
+        <w:tblW w:w="8828" w:type="dxa"/>
+        <w:tblInd w:w="-108" w:type="dxa"/>
+        <w:tblBorders>
+          <w:top w:val="single" w:sz="4" w:space="0" w:color="000000"/>
+          <w:left w:val="single" w:sz="4" w:space="0" w:color="000000"/>
+          <w:bottom w:val="single" w:sz="4" w:space="0" w:color="000000"/>
+          <w:right w:val="single" w:sz="4" w:space="0" w:color="000000"/>
+          <w:insideH w:val="single" w:sz="4" w:space="0" w:color="000000"/>
+          <w:insideV w:val="single" w:sz="4" w:space="0" w:color="000000"/>
+        </w:tblBorders>
+        <w:tblLayout w:type="fixed"/>
+        <w:tblLook w:val="0400" w:firstRow="0" w:lastRow="0" w:firstColumn="0" w:lastColumn="0" w:noHBand="0" w:noVBand="1"/>
+      </w:tblPr>
+      <w:tblGrid>
+        <w:gridCol w:w="4414"/>
+        <w:gridCol w:w="4414"/>
+      </w:tblGrid>
+      <w:tr>
+        <w:trPr>
+          <w:trHeight w:val="959"/>
+        </w:trPr>
+        <w:tc>
+          <w:tcPr>
+            <w:tcW w:w="4414" w:type="dxa"/>
+            <w:tcBorders>
+              <w:top w:val="single" w:sz="4" w:space="0" w:color="000000"/>
+              <w:left w:val="single" w:sz="4" w:space="0" w:color="000000"/>
+              <w:bottom w:val="single" w:sz="4" w:space="0" w:color="000000"/>
+              <w:right w:val="single" w:sz="4" w:space="0" w:color="000000"/>
+            </w:tcBorders>
+          </w:tcPr>
+          <w:p>
+            <w:pPr>
+              <w:rPr>
+                <w:b/>
+                <w:bCs/>
+                <w:sz w:val="20"/>
+                <w:szCs w:val="20"/>
+              </w:rPr>
+            </w:pPr>
+            <w:r>
+              <w:rPr>
+                <w:sz w:val="20"/>
+                <w:szCs w:val="20"/>
+              </w:rPr>
+              <w:t>Nombre de usuario:</w:t>
+            </w:r>
+          </w:p>
+        </w:tc>
+        <w:tc>
+          <w:tcPr>
+            <w:tcW w:w="4414" w:type="dxa"/>
+            <w:tcBorders>
+              <w:top w:val="single" w:sz="4" w:space="0" w:color="000000"/>
+              <w:left w:val="single" w:sz="4" w:space="0" w:color="000000"/>
+              <w:bottom w:val="single" w:sz="4" w:space="0" w:color="000000"/>
+              <w:right w:val="single" w:sz="4" w:space="0" w:color="000000"/>
+            </w:tcBorders>
+          </w:tcPr>
+          <w:p>
+            <w:pPr>
+              <w:rPr>
+                <w:b/>
+                <w:bCs/>
+                <w:sz w:val="20"/>
+                <w:szCs w:val="20"/>
+              </w:rPr>
+            </w:pPr>
+            <w:r>
+              <w:rPr>
+                <w:sz w:val="20"/>
+                <w:szCs w:val="20"/>
+              </w:rPr>
+              <w:t>Administrador</w:t>
+            </w:r>
+          </w:p>
+        </w:tc>
+      </w:tr>
+      <w:tr>
+        <w:trPr>
+          <w:trHeight w:val="827"/>
+        </w:trPr>
+        <w:tc>
+          <w:tcPr>
+            <w:tcW w:w="4414" w:type="dxa"/>
+            <w:tcBorders>
+              <w:top w:val="single" w:sz="4" w:space="0" w:color="000000"/>
+              <w:left w:val="single" w:sz="4" w:space="0" w:color="000000"/>
+              <w:bottom w:val="single" w:sz="4" w:space="0" w:color="000000"/>
+              <w:right w:val="single" w:sz="4" w:space="0" w:color="000000"/>
+            </w:tcBorders>
+          </w:tcPr>
+          <w:p>
+            <w:pPr>
+              <w:rPr>
+                <w:b/>
+                <w:bCs/>
+                <w:sz w:val="20"/>
+                <w:szCs w:val="20"/>
+              </w:rPr>
+            </w:pPr>
+            <w:r>
+              <w:rPr>
+                <w:sz w:val="20"/>
+                <w:szCs w:val="20"/>
+              </w:rPr>
+              <w:t>Formación:</w:t>
+            </w:r>
+          </w:p>
+        </w:tc>
+        <w:tc>
+          <w:tcPr>
+            <w:tcW w:w="4414" w:type="dxa"/>
+            <w:tcBorders>
+              <w:top w:val="single" w:sz="4" w:space="0" w:color="000000"/>
+              <w:left w:val="single" w:sz="4" w:space="0" w:color="000000"/>
+              <w:bottom w:val="single" w:sz="4" w:space="0" w:color="000000"/>
+              <w:right w:val="single" w:sz="4" w:space="0" w:color="000000"/>
+            </w:tcBorders>
+          </w:tcPr>
+          <w:p>
+            <w:pPr>
+              <w:rPr>
+                <w:b/>
+                <w:bCs/>
+                <w:sz w:val="20"/>
+                <w:szCs w:val="20"/>
+              </w:rPr>
+            </w:pPr>
+            <w:r>
+              <w:rPr>
+                <w:sz w:val="20"/>
+                <w:szCs w:val="20"/>
+              </w:rPr>
+              <w:t>Tecnólogo en análisis y desarrollo de software</w:t>
+            </w:r>
+          </w:p>
+        </w:tc>
+      </w:tr>
+      <w:tr>
+        <w:trPr>
+          <w:trHeight w:val="999"/>
+        </w:trPr>
+        <w:tc>
+          <w:tcPr>
+            <w:tcW w:w="4414" w:type="dxa"/>
+            <w:tcBorders>
+              <w:top w:val="single" w:sz="4" w:space="0" w:color="000000"/>
+              <w:left w:val="single" w:sz="4" w:space="0" w:color="000000"/>
+              <w:bottom w:val="single" w:sz="4" w:space="0" w:color="000000"/>
+              <w:right w:val="single" w:sz="4" w:space="0" w:color="000000"/>
+            </w:tcBorders>
+          </w:tcPr>
+          <w:p>
+            <w:pPr>
+              <w:rPr>
+                <w:b/>
+                <w:bCs/>
+                <w:sz w:val="20"/>
+                <w:szCs w:val="20"/>
+              </w:rPr>
+            </w:pPr>
+            <w:r>
+              <w:rPr>
+                <w:sz w:val="20"/>
+                <w:szCs w:val="20"/>
+              </w:rPr>
+              <w:lastRenderedPageBreak/>
+              <w:t>Actividades:</w:t>
+            </w:r>
+          </w:p>
+        </w:tc>
+        <w:tc>
+          <w:tcPr>
+            <w:tcW w:w="4414" w:type="dxa"/>
+            <w:tcBorders>
+              <w:top w:val="single" w:sz="4" w:space="0" w:color="000000"/>
+              <w:left w:val="single" w:sz="4" w:space="0" w:color="000000"/>
+              <w:bottom w:val="single" w:sz="4" w:space="0" w:color="000000"/>
+              <w:right w:val="single" w:sz="4" w:space="0" w:color="000000"/>
+            </w:tcBorders>
+          </w:tcPr>
+          <w:p>
             <w:pPr>
               <w:rPr>
                 <w:b/>
@@ -4544,6 +4744,35 @@
           <w:szCs w:val="20"/>
         </w:rPr>
         <w:t xml:space="preserve"> capacidad de procesamiento).</w:t>
+      </w:r>
+    </w:p>
+    <w:p>
+      <w:pPr>
+        <w:widowControl/>
+        <w:numPr>
+          <w:ilvl w:val="0"/>
+          <w:numId w:val="11"/>
+        </w:numPr>
+        <w:rPr>
+          <w:sz w:val="20"/>
+          <w:szCs w:val="20"/>
+        </w:rPr>
+      </w:pPr>
+      <w:r>
+        <w:rPr>
+          <w:b/>
+          <w:bCs/>
+          <w:sz w:val="20"/>
+          <w:szCs w:val="20"/>
+        </w:rPr>
+        <w:t>Pruebas en tiempo real:</w:t>
+      </w:r>
+      <w:r>
+        <w:rPr>
+          <w:sz w:val="20"/>
+          <w:szCs w:val="20"/>
+        </w:rPr>
+        <w:t xml:space="preserve"> Las pruebas piloto deben realizarse en entornos reales (institutos, tiendas, etc.) lo cual depende de permisos y colaboración externa</w:t>
       </w:r>
     </w:p>
     <w:p>
@@ -4566,14 +4795,13 @@
           <w:sz w:val="20"/>
           <w:szCs w:val="20"/>
         </w:rPr>
-        <w:t>Pruebas en tiempo real:</w:t>
+        <w:t>Modelado 3D del alfabeto: la representación del alfabeto en lengua de señas mediante modelado 3D es una funcionalidad en evaluación; si su desarrollo resulta demasiado complejo o lento respecto al plazo del proyecto, será descartada y se optará por imágenes o animaciones 2D.</w:t>
       </w:r>
       <w:r>
         <w:rPr>
           <w:sz w:val="20"/>
           <w:szCs w:val="20"/>
         </w:rPr>
-        <w:t xml:space="preserve"> Las pruebas piloto deben realizarse en entornos reales (institutos, tiendas, etc.) lo cual depende de permisos y colaboración externa</w:t>
       </w:r>
     </w:p>
     <w:p>
@@ -4868,7 +5096,7 @@
     </w:p>
     <w:p>
       <w:r>
-        <w:t>La interfaz de usuario será inclusiva, intuitiva y accesible. Contará con botones grandes, iconografía clara y colores contrastantes. Tendrá una sección para capturar lenguaje de señas mediante cámara y mostrar el texto traducido en pantalla, así como una opción para ingresar texto que se convierta en señas mediante animaciones visuales o un avatar animado.</w:t>
+        <w:t>La interfaz de usuario será inclusiva, intuitiva y accesible. Contará con botones grandes, iconografía clara y colores contrastantes. Tendrá una sección para capturar lenguaje de señas mediante la cámara y mostrar el texto traducido en pantalla, con la opción de reproducir el resultado en audio, así como un apartado para visualizar el alfabeto en lengua de señas.</w:t>
       </w:r>
     </w:p>
     <w:p/>
@@ -4884,11 +5112,6 @@
       </w:r>
     </w:p>
     <w:p/>
-    <w:p>
-      <w:r>
-        <w:t>Campo de texto para introducir mensajes.</w:t>
-      </w:r>
-    </w:p>
     <w:p/>
     <w:p>
       <w:r>
@@ -4929,13 +5152,13 @@
     <w:p/>
     <w:p>
       <w:r>
-        <w:t>Cámara web (preferiblemente HD o superior).</w:t>
+        <w:t>Cámara del dispositivo móvil (resolución mínima 720p).</w:t>
       </w:r>
     </w:p>
     <w:p/>
     <w:p>
       <w:r>
-        <w:t>Micrófono (funcional para el reconocimiento de palabras).</w:t>
+        <w:t>Altavoz o salida de audio, para la reproducción de la traducción en modo voz.</w:t>
       </w:r>
     </w:p>
     <w:p/>
@@ -4947,7 +5170,7 @@
     <w:p/>
     <w:p>
       <w:r>
-        <w:t>Dispositivos con capacidad de procesamiento visual básica.</w:t>
+        <w:t>Dispositivo con capacidad de procesamiento suficiente para inferencia de visión por computadora en tiempo real.</w:t>
       </w:r>
     </w:p>
     <w:p/>
@@ -4976,48 +5199,23 @@
       </w:r>
     </w:p>
     <w:p/>
+    <w:p/>
     <w:p>
       <w:r>
-        <w:t>Windows 10 o superior</w:t>
+        <w:t>Android 9 (API 28) o superior</w:t>
       </w:r>
     </w:p>
-    <w:p/>
     <w:p>
       <w:r>
-        <w:t>Android 9+</w:t>
+        <w:t>iOS 14 o superior</w:t>
       </w:r>
     </w:p>
     <w:p/>
     <w:p/>
-    <w:p>
-      <w:r>
-        <w:t>Navegadores compatibles:</w:t>
-      </w:r>
-    </w:p>
     <w:p/>
-    <w:p>
-      <w:r>
-        <w:t>Google Chrome</w:t>
-      </w:r>
-    </w:p>
     <w:p/>
-    <w:p>
-      <w:r>
-        <w:t>Mozilla Firefox</w:t>
-      </w:r>
-    </w:p>
     <w:p/>
-    <w:p>
-      <w:r>
-        <w:t>Microsoft Edge</w:t>
-      </w:r>
-    </w:p>
     <w:p/>
-    <w:p>
-      <w:r>
-        <w:t>Safari</w:t>
-      </w:r>
-    </w:p>
     <w:p/>
     <w:p/>
     <w:p/>
@@ -5208,7 +5406,7 @@
         <w:t> </w:t>
       </w:r>
       <w:r>
-        <w:t>ERF3.1 conversión de texto/audio a seña</w:t>
+        <w:t>ERF3.1 Activación del modo traducción</w:t>
       </w:r>
       <w:r>
         <w:br/>
@@ -5517,29 +5715,8 @@
             <w:tcW w:w="2405" w:type="dxa"/>
           </w:tcPr>
           <w:p>
-            <w:pPr>
-              <w:pBdr>
-                <w:top w:val="nil"/>
-                <w:left w:val="nil"/>
-                <w:bottom w:val="nil"/>
-                <w:right w:val="nil"/>
-                <w:between w:val="nil"/>
-              </w:pBdr>
-              <w:spacing w:line="275" w:lineRule="auto"/>
-              <w:ind w:left="107"/>
-              <w:rPr>
-                <w:color w:val="000000"/>
-                <w:sz w:val="24"/>
-                <w:szCs w:val="24"/>
-              </w:rPr>
-            </w:pPr>
-            <w:r>
-              <w:rPr>
-                <w:color w:val="000000"/>
-                <w:sz w:val="24"/>
-                <w:szCs w:val="24"/>
-              </w:rPr>
-              <w:t>Descripción</w:t>
+            <w:r>
+              <w:t>El sistema gestionará el ciclo de vida de la cuenta del usuario: registro, autenticación y recuperación de acceso, según se detalla en ERF1.1, ERF1.2 y ERF1.3.</w:t>
             </w:r>
           </w:p>
         </w:tc>
@@ -6351,29 +6528,10 @@
             <w:tcW w:w="2405" w:type="dxa"/>
           </w:tcPr>
           <w:p>
-            <w:pPr>
-              <w:pBdr>
-                <w:top w:val="nil"/>
-                <w:left w:val="nil"/>
-                <w:bottom w:val="nil"/>
-                <w:right w:val="nil"/>
-                <w:between w:val="nil"/>
-              </w:pBdr>
-              <w:spacing w:line="275" w:lineRule="auto"/>
-              <w:ind w:left="107"/>
-              <w:rPr>
-                <w:color w:val="000000"/>
-                <w:sz w:val="24"/>
-                <w:szCs w:val="24"/>
-              </w:rPr>
-            </w:pPr>
-            <w:r>
-              <w:rPr>
-                <w:color w:val="000000"/>
-                <w:sz w:val="24"/>
-                <w:szCs w:val="24"/>
-              </w:rPr>
-              <w:t>Criterio de aceptación</w:t>
+            <w:r>
+              <w:t>El formulario de registro debe contar con campos de caracterización de usuario básicos: nombre, correo electrónico y contraseña.</w:t>
+              <w:br/>
+              <w:t>Se deben aceptar los términos y condiciones para poder registrarse de manera exitosa.</w:t>
             </w:r>
           </w:p>
         </w:tc>
@@ -6685,29 +6843,8 @@
             <w:tcW w:w="2405" w:type="dxa"/>
           </w:tcPr>
           <w:p>
-            <w:pPr>
-              <w:pBdr>
-                <w:top w:val="nil"/>
-                <w:left w:val="nil"/>
-                <w:bottom w:val="nil"/>
-                <w:right w:val="nil"/>
-                <w:between w:val="nil"/>
-              </w:pBdr>
-              <w:spacing w:line="275" w:lineRule="auto"/>
-              <w:ind w:left="107"/>
-              <w:rPr>
-                <w:color w:val="000000"/>
-                <w:sz w:val="24"/>
-                <w:szCs w:val="24"/>
-              </w:rPr>
-            </w:pPr>
-            <w:r>
-              <w:rPr>
-                <w:color w:val="000000"/>
-                <w:sz w:val="24"/>
-                <w:szCs w:val="24"/>
-              </w:rPr>
-              <w:t>Descripción</w:t>
+            <w:r>
+              <w:t>El sistema permitirá el inicio de sesión mediante credenciales propias (correo y contraseña) o mediante una cuenta externa de Google o Facebook, a elección del usuario.</w:t>
             </w:r>
           </w:p>
         </w:tc>
@@ -6954,29 +7091,8 @@
             <w:tcW w:w="2405" w:type="dxa"/>
           </w:tcPr>
           <w:p>
-            <w:pPr>
-              <w:pBdr>
-                <w:top w:val="nil"/>
-                <w:left w:val="nil"/>
-                <w:bottom w:val="nil"/>
-                <w:right w:val="nil"/>
-                <w:between w:val="nil"/>
-              </w:pBdr>
-              <w:spacing w:line="275" w:lineRule="auto"/>
-              <w:ind w:left="107"/>
-              <w:rPr>
-                <w:color w:val="000000"/>
-                <w:sz w:val="24"/>
-                <w:szCs w:val="24"/>
-              </w:rPr>
-            </w:pPr>
-            <w:r>
-              <w:rPr>
-                <w:color w:val="000000"/>
-                <w:sz w:val="24"/>
-                <w:szCs w:val="24"/>
-              </w:rPr>
-              <w:t>Criterio de aceptación</w:t>
+            <w:r>
+              <w:t>El sistema debe validar las credenciales contra la base de datos y conceder acceso solo si coinciden. Para el acceso externo, el usuario debe contar con una cuenta activa de Google o Facebook. Un mismo usuario puede tener vinculados varios proveedores externos.</w:t>
             </w:r>
           </w:p>
         </w:tc>
@@ -11132,24 +11248,8 @@
             <w:gridSpan w:val="2"/>
           </w:tcPr>
           <w:p>
-            <w:pPr>
-              <w:spacing w:line="256" w:lineRule="auto"/>
-              <w:ind w:left="107"/>
-              <w:rPr>
-                <w:b/>
-                <w:bCs/>
-                <w:sz w:val="24"/>
-                <w:szCs w:val="24"/>
-              </w:rPr>
-            </w:pPr>
-            <w:r>
-              <w:rPr>
-                <w:b/>
-                <w:bCs/>
-                <w:sz w:val="24"/>
-                <w:szCs w:val="24"/>
-              </w:rPr>
-              <w:t>Notificaciones en Pantalla (ERF4.2)</w:t>
+            <w:r>
+              <w:t>Notificaciones en Pantalla (ERF4.1)</w:t>
             </w:r>
           </w:p>
         </w:tc>
@@ -11570,101 +11670,9 @@
             <w:gridSpan w:val="2"/>
           </w:tcPr>
           <w:p>
-            <w:pPr>
-              <w:pBdr>
-                <w:top w:val="nil"/>
-                <w:left w:val="nil"/>
-                <w:bottom w:val="nil"/>
-                <w:right w:val="nil"/>
-                <w:between w:val="nil"/>
-              </w:pBdr>
-              <w:spacing w:line="256" w:lineRule="auto"/>
-              <w:ind w:left="107"/>
-              <w:rPr>
-                <w:b/>
-                <w:bCs/>
-                <w:color w:val="000000"/>
-                <w:sz w:val="24"/>
-                <w:szCs w:val="24"/>
-              </w:rPr>
-            </w:pPr>
-            <w:r>
-              <w:rPr>
-                <w:b/>
-                <w:bCs/>
-                <w:sz w:val="24"/>
-                <w:szCs w:val="24"/>
-              </w:rPr>
-              <w:t xml:space="preserve">gestión </w:t>
-            </w:r>
-            <w:r>
-              <w:rPr>
-                <w:b/>
-                <w:bCs/>
-                <w:color w:val="000000"/>
-                <w:sz w:val="24"/>
-                <w:szCs w:val="24"/>
-              </w:rPr>
-              <w:t>de</w:t>
-            </w:r>
-            <w:r>
-              <w:rPr>
-                <w:b/>
-                <w:bCs/>
-                <w:sz w:val="24"/>
-                <w:szCs w:val="24"/>
-              </w:rPr>
-              <w:t xml:space="preserve">l perfil </w:t>
-            </w:r>
-            <w:r>
-              <w:rPr>
-                <w:b/>
-                <w:bCs/>
-                <w:color w:val="000000"/>
-                <w:sz w:val="24"/>
-                <w:szCs w:val="24"/>
-              </w:rPr>
-              <w:t>(</w:t>
-            </w:r>
-            <w:r>
-              <w:rPr>
-                <w:b/>
-                <w:bCs/>
-                <w:sz w:val="24"/>
-                <w:szCs w:val="24"/>
-              </w:rPr>
-              <w:t>ERF 5</w:t>
-            </w:r>
-            <w:r>
-              <w:rPr>
-                <w:b/>
-                <w:bCs/>
-                <w:color w:val="000000"/>
-                <w:sz w:val="24"/>
-                <w:szCs w:val="24"/>
-              </w:rPr>
-              <w:t>)</w:t>
-            </w:r>
-          </w:p>
-          <w:p>
-            <w:pPr>
-              <w:pBdr>
-                <w:top w:val="nil"/>
-                <w:left w:val="nil"/>
-                <w:bottom w:val="nil"/>
-                <w:right w:val="nil"/>
-                <w:between w:val="nil"/>
-              </w:pBdr>
-              <w:spacing w:line="256" w:lineRule="auto"/>
-              <w:ind w:left="107"/>
-              <w:rPr>
-                <w:b/>
-                <w:bCs/>
-                <w:color w:val="000000"/>
-                <w:sz w:val="24"/>
-                <w:szCs w:val="24"/>
-              </w:rPr>
-            </w:pPr>
+            <w:r>
+              <w:t>Gestión del Perfil (RF5)</w:t>
+            </w:r>
           </w:p>
         </w:tc>
       </w:tr>
@@ -11744,29 +11752,8 @@
             <w:tcW w:w="2405" w:type="dxa"/>
           </w:tcPr>
           <w:p>
-            <w:pPr>
-              <w:pBdr>
-                <w:top w:val="nil"/>
-                <w:left w:val="nil"/>
-                <w:bottom w:val="nil"/>
-                <w:right w:val="nil"/>
-                <w:between w:val="nil"/>
-              </w:pBdr>
-              <w:spacing w:line="275" w:lineRule="auto"/>
-              <w:ind w:left="107"/>
-              <w:rPr>
-                <w:color w:val="000000"/>
-                <w:sz w:val="24"/>
-                <w:szCs w:val="24"/>
-              </w:rPr>
-            </w:pPr>
-            <w:r>
-              <w:rPr>
-                <w:color w:val="000000"/>
-                <w:sz w:val="24"/>
-                <w:szCs w:val="24"/>
-              </w:rPr>
-              <w:t>Descripción</w:t>
+            <w:r>
+              <w:t>El sistema permitirá al usuario consultar y administrar su perfil personal, incluyendo la visualización de sus datos, la modificación de su contraseña y la configuración de tema e idioma de la interfaz.</w:t>
             </w:r>
           </w:p>
         </w:tc>
@@ -11811,29 +11798,8 @@
             <w:tcW w:w="2405" w:type="dxa"/>
           </w:tcPr>
           <w:p>
-            <w:pPr>
-              <w:pBdr>
-                <w:top w:val="nil"/>
-                <w:left w:val="nil"/>
-                <w:bottom w:val="nil"/>
-                <w:right w:val="nil"/>
-                <w:between w:val="nil"/>
-              </w:pBdr>
-              <w:spacing w:before="1" w:line="257" w:lineRule="auto"/>
-              <w:ind w:left="107"/>
-              <w:rPr>
-                <w:color w:val="000000"/>
-                <w:sz w:val="24"/>
-                <w:szCs w:val="24"/>
-              </w:rPr>
-            </w:pPr>
-            <w:r>
-              <w:rPr>
-                <w:color w:val="000000"/>
-                <w:sz w:val="24"/>
-                <w:szCs w:val="24"/>
-              </w:rPr>
-              <w:t>Entrada</w:t>
+            <w:r>
+              <w:t>Selección de la opción "Perfil" en la barra de navegación.</w:t>
             </w:r>
           </w:p>
         </w:tc>
@@ -11878,29 +11844,8 @@
             <w:tcW w:w="2405" w:type="dxa"/>
           </w:tcPr>
           <w:p>
-            <w:pPr>
-              <w:pBdr>
-                <w:top w:val="nil"/>
-                <w:left w:val="nil"/>
-                <w:bottom w:val="nil"/>
-                <w:right w:val="nil"/>
-                <w:between w:val="nil"/>
-              </w:pBdr>
-              <w:spacing w:line="256" w:lineRule="auto"/>
-              <w:ind w:left="107"/>
-              <w:rPr>
-                <w:color w:val="000000"/>
-                <w:sz w:val="24"/>
-                <w:szCs w:val="24"/>
-              </w:rPr>
-            </w:pPr>
-            <w:r>
-              <w:rPr>
-                <w:color w:val="000000"/>
-                <w:sz w:val="24"/>
-                <w:szCs w:val="24"/>
-              </w:rPr>
-              <w:t>Salida</w:t>
+            <w:r>
+              <w:t>Panel de perfil con los datos del usuario y las opciones de configuración disponibles.</w:t>
             </w:r>
           </w:p>
         </w:tc>
@@ -11945,30 +11890,8 @@
             <w:tcW w:w="2405" w:type="dxa"/>
           </w:tcPr>
           <w:p>
-            <w:pPr>
-              <w:pBdr>
-                <w:top w:val="nil"/>
-                <w:left w:val="nil"/>
-                <w:bottom w:val="nil"/>
-                <w:right w:val="nil"/>
-                <w:between w:val="nil"/>
-              </w:pBdr>
-              <w:spacing w:line="275" w:lineRule="auto"/>
-              <w:ind w:left="107"/>
-              <w:rPr>
-                <w:color w:val="000000"/>
-                <w:sz w:val="24"/>
-                <w:szCs w:val="24"/>
-              </w:rPr>
-            </w:pPr>
-            <w:r>
-              <w:rPr>
-                <w:color w:val="000000"/>
-                <w:sz w:val="24"/>
-                <w:szCs w:val="24"/>
-              </w:rPr>
-              <w:lastRenderedPageBreak/>
-              <w:t>Acción</w:t>
+            <w:r>
+              <w:t>Al ingresar al módulo, el sistema cargará la información del usuario y presentará las opciones de configuración descritas en ERF5.1 a ERF5.5.</w:t>
             </w:r>
           </w:p>
         </w:tc>
@@ -12014,29 +11937,8 @@
             <w:tcW w:w="2405" w:type="dxa"/>
           </w:tcPr>
           <w:p>
-            <w:pPr>
-              <w:pBdr>
-                <w:top w:val="nil"/>
-                <w:left w:val="nil"/>
-                <w:bottom w:val="nil"/>
-                <w:right w:val="nil"/>
-                <w:between w:val="nil"/>
-              </w:pBdr>
-              <w:spacing w:line="275" w:lineRule="auto"/>
-              <w:ind w:left="107"/>
-              <w:rPr>
-                <w:color w:val="000000"/>
-                <w:sz w:val="24"/>
-                <w:szCs w:val="24"/>
-              </w:rPr>
-            </w:pPr>
-            <w:r>
-              <w:rPr>
-                <w:color w:val="000000"/>
-                <w:sz w:val="24"/>
-                <w:szCs w:val="24"/>
-              </w:rPr>
-              <w:t>Criterio de aceptación</w:t>
+            <w:r>
+              <w:t>El panel debe agrupar de forma clara las opciones de perfil y configuración. Cada opción debe conducir al submódulo correspondiente sin errores.</w:t>
             </w:r>
           </w:p>
         </w:tc>
@@ -12728,7 +12630,7 @@
                     <w:sz w:val="24"/>
                     <w:szCs w:val="24"/>
                   </w:rPr>
-                  <w:t>Cambiar tema de la pantalla(claro/claro) (ERF 5.2)</w:t>
+                  <w:t>Cambiar tema de la pantalla(claro/oscuro) (ERF 5.2)</w:t>
                 </w:r>
               </w:p>
               <w:p>
@@ -21598,132 +21500,13 @@
             <w:gridSpan w:val="4"/>
           </w:tcPr>
           <w:p>
-            <w:pPr>
-              <w:pBdr>
-                <w:top w:val="nil"/>
-                <w:left w:val="nil"/>
-                <w:bottom w:val="nil"/>
-                <w:right w:val="nil"/>
-                <w:between w:val="nil"/>
-              </w:pBdr>
-              <w:spacing w:before="11"/>
-              <w:ind w:left="110"/>
-              <w:rPr>
-                <w:color w:val="000000"/>
-                <w:sz w:val="20"/>
-                <w:szCs w:val="20"/>
-              </w:rPr>
-            </w:pPr>
-            <w:r>
-              <w:rPr>
-                <w:color w:val="000000"/>
-                <w:sz w:val="20"/>
-                <w:szCs w:val="20"/>
-              </w:rPr>
+            <w:r>
               <w:t>Criterios de aceptación</w:t>
-            </w:r>
-          </w:p>
-          <w:p>
-            <w:pPr>
-              <w:pBdr>
-                <w:top w:val="nil"/>
-                <w:left w:val="nil"/>
-                <w:bottom w:val="nil"/>
-                <w:right w:val="nil"/>
-                <w:between w:val="nil"/>
-              </w:pBdr>
-              <w:spacing w:before="12"/>
-              <w:rPr>
-                <w:color w:val="000000"/>
-                <w:sz w:val="20"/>
-                <w:szCs w:val="20"/>
-              </w:rPr>
-            </w:pPr>
-          </w:p>
-          <w:p>
-            <w:pPr>
-              <w:numPr>
-                <w:ilvl w:val="0"/>
-                <w:numId w:val="2"/>
-              </w:numPr>
-              <w:pBdr>
-                <w:top w:val="nil"/>
-                <w:left w:val="nil"/>
-                <w:bottom w:val="nil"/>
-                <w:right w:val="nil"/>
-                <w:between w:val="nil"/>
-              </w:pBdr>
-              <w:tabs>
-                <w:tab w:val="left" w:pos="830"/>
-              </w:tabs>
-              <w:spacing w:line="271" w:lineRule="auto"/>
-              <w:rPr>
-                <w:color w:val="000000"/>
-                <w:sz w:val="20"/>
-                <w:szCs w:val="20"/>
-              </w:rPr>
-            </w:pPr>
-            <w:r>
-              <w:rPr>
-                <w:color w:val="000000"/>
-                <w:sz w:val="20"/>
-                <w:szCs w:val="20"/>
-              </w:rPr>
-              <w:t xml:space="preserve">  El tiempo de respuesta ante solicitudes no debe superar los 5 segundos.</w:t>
-            </w:r>
-          </w:p>
-          <w:p>
-            <w:pPr>
-              <w:numPr>
-                <w:ilvl w:val="0"/>
-                <w:numId w:val="2"/>
-              </w:numPr>
-              <w:pBdr>
-                <w:top w:val="nil"/>
-                <w:left w:val="nil"/>
-                <w:bottom w:val="nil"/>
-                <w:right w:val="nil"/>
-                <w:between w:val="nil"/>
-              </w:pBdr>
-              <w:tabs>
-                <w:tab w:val="left" w:pos="830"/>
-              </w:tabs>
-              <w:spacing w:line="271" w:lineRule="auto"/>
-              <w:rPr>
-                <w:color w:val="000000"/>
-                <w:sz w:val="20"/>
-                <w:szCs w:val="20"/>
-              </w:rPr>
-            </w:pPr>
-            <w:r>
-              <w:rPr>
-                <w:color w:val="000000"/>
-                <w:sz w:val="20"/>
-                <w:szCs w:val="20"/>
-              </w:rPr>
-              <w:t xml:space="preserve">  El tiempo de carga de cualquier página no debe exceder los 5 segundos.</w:t>
-            </w:r>
-          </w:p>
-          <w:p>
-            <w:pPr>
-              <w:pBdr>
-                <w:top w:val="nil"/>
-                <w:left w:val="nil"/>
-                <w:bottom w:val="nil"/>
-                <w:right w:val="nil"/>
-                <w:between w:val="nil"/>
-              </w:pBdr>
-              <w:tabs>
-                <w:tab w:val="left" w:pos="830"/>
-              </w:tabs>
-              <w:spacing w:line="271" w:lineRule="auto"/>
-              <w:ind w:left="830"/>
-              <w:rPr>
-                <w:color w:val="000000"/>
-                <w:sz w:val="20"/>
-                <w:szCs w:val="20"/>
-              </w:rPr>
-            </w:pPr>
+              <w:br/>
+              <w:t>El reconocimiento y traducción de una seña no debe superar 1 segundo desde su captura.</w:t>
+              <w:br/>
+              <w:t>El tiempo de carga de cualquier pantalla de la aplicación no debe exceder 3 segundos.</w:t>
+            </w:r>
           </w:p>
         </w:tc>
       </w:tr>
@@ -25494,83 +25277,10 @@
             <w:gridSpan w:val="4"/>
           </w:tcPr>
           <w:p>
-            <w:pPr>
-              <w:pBdr>
-                <w:top w:val="nil"/>
-                <w:left w:val="nil"/>
-                <w:bottom w:val="nil"/>
-                <w:right w:val="nil"/>
-                <w:between w:val="nil"/>
-              </w:pBdr>
-              <w:spacing w:before="11"/>
-              <w:ind w:left="81"/>
-              <w:rPr>
-                <w:b/>
-                <w:bCs/>
-                <w:color w:val="000000"/>
-                <w:sz w:val="20"/>
-                <w:szCs w:val="20"/>
-              </w:rPr>
-            </w:pPr>
-            <w:r>
-              <w:rPr>
-                <w:b/>
-                <w:bCs/>
-                <w:color w:val="000000"/>
-                <w:sz w:val="20"/>
-                <w:szCs w:val="20"/>
-              </w:rPr>
+            <w:r>
               <w:t>Criterios de aceptación</w:t>
-            </w:r>
-          </w:p>
-          <w:p>
-            <w:pPr>
-              <w:pBdr>
-                <w:top w:val="nil"/>
-                <w:left w:val="nil"/>
-                <w:bottom w:val="nil"/>
-                <w:right w:val="nil"/>
-                <w:between w:val="nil"/>
-              </w:pBdr>
-              <w:tabs>
-                <w:tab w:val="left" w:pos="830"/>
-              </w:tabs>
-              <w:spacing w:before="20" w:line="230" w:lineRule="auto"/>
-              <w:ind w:left="830" w:right="411"/>
-              <w:rPr>
-                <w:color w:val="000000"/>
-                <w:sz w:val="24"/>
-                <w:szCs w:val="24"/>
-              </w:rPr>
-            </w:pPr>
-          </w:p>
-          <w:p>
-            <w:pPr>
-              <w:pBdr>
-                <w:top w:val="nil"/>
-                <w:left w:val="nil"/>
-                <w:bottom w:val="nil"/>
-                <w:right w:val="nil"/>
-                <w:between w:val="nil"/>
-              </w:pBdr>
-              <w:tabs>
-                <w:tab w:val="left" w:pos="830"/>
-              </w:tabs>
-              <w:spacing w:before="20" w:line="230" w:lineRule="auto"/>
-              <w:ind w:left="830" w:right="411"/>
-              <w:rPr>
-                <w:color w:val="000000"/>
-                <w:sz w:val="20"/>
-                <w:szCs w:val="20"/>
-              </w:rPr>
-            </w:pPr>
-            <w:r>
-              <w:rPr>
-                <w:color w:val="000000"/>
-                <w:sz w:val="24"/>
-                <w:szCs w:val="24"/>
-              </w:rPr>
-              <w:t>El sistema debe mantener su funcionamiento sin importar el número de usuarios concurrentes.</w:t>
+              <w:br/>
+              <w:t>El sistema debe mantener los tiempos de respuesta establecidos en RNF1 con hasta 100 usuarios concurrentes, sin degradación perceptible del servicio.</w:t>
             </w:r>
           </w:p>
         </w:tc>
@@ -27386,6 +27096,948 @@
                 <w:szCs w:val="24"/>
               </w:rPr>
               <w:t>La aplicación debe recuperar su funcionamiento en un máximo de 5 minutos ante cualquier fallo.</w:t>
+            </w:r>
+          </w:p>
+        </w:tc>
+      </w:tr>
+    </w:tbl>
+    <w:tbl>
+      <w:tblPr>
+        <w:tblStyle w:val="affffffff"/>
+        <w:tblpPr w:leftFromText="141" w:rightFromText="141" w:vertAnchor="text" w:tblpY="482"/>
+        <w:tblW w:w="9662" w:type="dxa"/>
+        <w:tblInd w:w="0" w:type="dxa"/>
+        <w:tblBorders>
+          <w:top w:val="single" w:sz="4" w:space="0" w:color="000000"/>
+          <w:left w:val="single" w:sz="4" w:space="0" w:color="000000"/>
+          <w:bottom w:val="single" w:sz="4" w:space="0" w:color="000000"/>
+          <w:right w:val="single" w:sz="4" w:space="0" w:color="000000"/>
+          <w:insideH w:val="single" w:sz="4" w:space="0" w:color="000000"/>
+          <w:insideV w:val="single" w:sz="4" w:space="0" w:color="000000"/>
+        </w:tblBorders>
+        <w:tblLayout w:type="fixed"/>
+        <w:tblLook w:val="0000" w:firstRow="0" w:lastRow="0" w:firstColumn="0" w:lastColumn="0" w:noHBand="0" w:noVBand="0"/>
+      </w:tblPr>
+      <w:tblGrid>
+        <w:gridCol w:w="4042"/>
+        <w:gridCol w:w="1486"/>
+        <w:gridCol w:w="1793"/>
+        <w:gridCol w:w="2341"/>
+      </w:tblGrid>
+      <w:tr>
+        <w:trPr>
+          <w:trHeight w:val="813"/>
+        </w:trPr>
+        <w:tc>
+          <w:tcPr>
+            <w:tcW w:w="5528" w:type="dxa"/>
+            <w:gridSpan w:val="2"/>
+          </w:tcPr>
+          <w:p>
+            <w:pPr>
+              <w:pBdr>
+                <w:top w:val="nil"/>
+                <w:left w:val="nil"/>
+                <w:bottom w:val="nil"/>
+                <w:right w:val="nil"/>
+                <w:between w:val="nil"/>
+              </w:pBdr>
+              <w:spacing w:before="9"/>
+              <w:ind w:left="81"/>
+              <w:rPr>
+                <w:color w:val="000000"/>
+                <w:sz w:val="20"/>
+                <w:szCs w:val="20"/>
+              </w:rPr>
+            </w:pPr>
+            <w:r>
+              <w:rPr>
+                <w:b/>
+                <w:bCs/>
+                <w:color w:val="000000"/>
+                <w:sz w:val="20"/>
+                <w:szCs w:val="20"/>
+              </w:rPr>
+              <w:t>Identificador: RNF8</w:t>
+            </w:r>
+            <w:r>
+              <w:rPr>
+                <w:color w:val="000000"/>
+                <w:sz w:val="20"/>
+                <w:szCs w:val="20"/>
+              </w:rPr>
+            </w:r>
+          </w:p>
+        </w:tc>
+        <w:tc>
+          <w:tcPr>
+            <w:tcW w:w="4134" w:type="dxa"/>
+            <w:gridSpan w:val="2"/>
+          </w:tcPr>
+          <w:p>
+            <w:pPr>
+              <w:pBdr>
+                <w:top w:val="nil"/>
+                <w:left w:val="nil"/>
+                <w:bottom w:val="nil"/>
+                <w:right w:val="nil"/>
+                <w:between w:val="nil"/>
+              </w:pBdr>
+              <w:spacing w:before="9"/>
+              <w:ind w:left="79"/>
+              <w:rPr>
+                <w:b/>
+                <w:bCs/>
+                <w:color w:val="000000"/>
+                <w:sz w:val="20"/>
+                <w:szCs w:val="20"/>
+              </w:rPr>
+            </w:pPr>
+            <w:r>
+              <w:rPr>
+                <w:b/>
+                <w:bCs/>
+                <w:color w:val="000000"/>
+                <w:sz w:val="20"/>
+                <w:szCs w:val="20"/>
+              </w:rPr>
+              <w:t>Nombre:</w:t>
+            </w:r>
+          </w:p>
+          <w:p>
+            <w:pPr>
+              <w:pBdr>
+                <w:top w:val="nil"/>
+                <w:left w:val="nil"/>
+                <w:bottom w:val="nil"/>
+                <w:right w:val="nil"/>
+                <w:between w:val="nil"/>
+              </w:pBdr>
+              <w:ind w:left="79"/>
+              <w:rPr>
+                <w:color w:val="000000"/>
+                <w:sz w:val="20"/>
+                <w:szCs w:val="20"/>
+              </w:rPr>
+            </w:pPr>
+            <w:r>
+              <w:rPr>
+                <w:color w:val="000000"/>
+                <w:sz w:val="20"/>
+                <w:szCs w:val="20"/>
+              </w:rPr>
+              <w:t>Protección de datos personales</w:t>
+            </w:r>
+          </w:p>
+        </w:tc>
+      </w:tr>
+      <w:tr>
+        <w:trPr>
+          <w:trHeight w:val="1153"/>
+        </w:trPr>
+        <w:tc>
+          <w:tcPr>
+            <w:tcW w:w="4042" w:type="dxa"/>
+          </w:tcPr>
+          <w:p>
+            <w:pPr>
+              <w:pBdr>
+                <w:top w:val="nil"/>
+                <w:left w:val="nil"/>
+                <w:bottom w:val="nil"/>
+                <w:right w:val="nil"/>
+                <w:between w:val="nil"/>
+              </w:pBdr>
+              <w:spacing w:before="9"/>
+              <w:ind w:left="81"/>
+              <w:rPr>
+                <w:b/>
+                <w:bCs/>
+                <w:color w:val="000000"/>
+                <w:sz w:val="20"/>
+                <w:szCs w:val="20"/>
+              </w:rPr>
+            </w:pPr>
+            <w:r>
+              <w:rPr>
+                <w:b/>
+                <w:bCs/>
+                <w:color w:val="000000"/>
+                <w:sz w:val="20"/>
+                <w:szCs w:val="20"/>
+              </w:rPr>
+              <w:t>Tipo:</w:t>
+            </w:r>
+          </w:p>
+          <w:p>
+            <w:pPr>
+              <w:pBdr>
+                <w:top w:val="nil"/>
+                <w:left w:val="nil"/>
+                <w:bottom w:val="nil"/>
+                <w:right w:val="nil"/>
+                <w:between w:val="nil"/>
+              </w:pBdr>
+              <w:ind w:left="81"/>
+              <w:rPr>
+                <w:color w:val="000000"/>
+                <w:sz w:val="20"/>
+                <w:szCs w:val="20"/>
+              </w:rPr>
+            </w:pPr>
+            <w:r>
+              <w:rPr>
+                <w:color w:val="000000"/>
+                <w:sz w:val="20"/>
+                <w:szCs w:val="20"/>
+              </w:rPr>
+              <w:t>Necesario</w:t>
+            </w:r>
+          </w:p>
+        </w:tc>
+        <w:tc>
+          <w:tcPr>
+            <w:tcW w:w="3279" w:type="dxa"/>
+            <w:gridSpan w:val="2"/>
+          </w:tcPr>
+          <w:p>
+            <w:pPr>
+              <w:pBdr>
+                <w:top w:val="nil"/>
+                <w:left w:val="nil"/>
+                <w:bottom w:val="nil"/>
+                <w:right w:val="nil"/>
+                <w:between w:val="nil"/>
+              </w:pBdr>
+              <w:spacing w:before="9"/>
+              <w:ind w:left="79"/>
+              <w:rPr>
+                <w:b/>
+                <w:bCs/>
+                <w:color w:val="000000"/>
+                <w:sz w:val="20"/>
+                <w:szCs w:val="20"/>
+              </w:rPr>
+            </w:pPr>
+            <w:r>
+              <w:rPr>
+                <w:b/>
+                <w:bCs/>
+                <w:color w:val="000000"/>
+                <w:sz w:val="20"/>
+                <w:szCs w:val="20"/>
+              </w:rPr>
+              <w:t>Requerimiento que lo utiliza o especializa:  Módulo de gestión de usuarios, módulo de traducción</w:t>
+            </w:r>
+            <w:r>
+              <w:rPr>
+                <w:color w:val="000000"/>
+              </w:rPr>
+            </w:r>
+            <w:r>
+              <w:rPr>
+                <w:b/>
+                <w:bCs/>
+                <w:color w:val="000000"/>
+                <w:sz w:val="20"/>
+                <w:szCs w:val="20"/>
+              </w:rPr>
+            </w:r>
+          </w:p>
+        </w:tc>
+        <w:tc>
+          <w:tcPr>
+            <w:tcW w:w="2341" w:type="dxa"/>
+          </w:tcPr>
+          <w:p>
+            <w:pPr>
+              <w:pBdr>
+                <w:top w:val="nil"/>
+                <w:left w:val="nil"/>
+                <w:bottom w:val="nil"/>
+                <w:right w:val="nil"/>
+                <w:between w:val="nil"/>
+              </w:pBdr>
+              <w:spacing w:before="9"/>
+              <w:ind w:left="81"/>
+              <w:rPr>
+                <w:b/>
+                <w:bCs/>
+                <w:color w:val="000000"/>
+                <w:sz w:val="20"/>
+                <w:szCs w:val="20"/>
+              </w:rPr>
+            </w:pPr>
+            <w:r>
+              <w:rPr>
+                <w:b/>
+                <w:bCs/>
+                <w:color w:val="000000"/>
+                <w:sz w:val="20"/>
+                <w:szCs w:val="20"/>
+              </w:rPr>
+              <w:t>¿Crítico?</w:t>
+            </w:r>
+          </w:p>
+          <w:p>
+            <w:pPr>
+              <w:pBdr>
+                <w:top w:val="nil"/>
+                <w:left w:val="nil"/>
+                <w:bottom w:val="nil"/>
+                <w:right w:val="nil"/>
+                <w:between w:val="nil"/>
+              </w:pBdr>
+              <w:ind w:left="141"/>
+              <w:rPr>
+                <w:color w:val="000000"/>
+                <w:sz w:val="20"/>
+                <w:szCs w:val="20"/>
+              </w:rPr>
+            </w:pPr>
+            <w:r>
+              <w:rPr>
+                <w:color w:val="000000"/>
+                <w:sz w:val="20"/>
+                <w:szCs w:val="20"/>
+              </w:rPr>
+              <w:t>Sí</w:t>
+            </w:r>
+          </w:p>
+        </w:tc>
+      </w:tr>
+      <w:tr>
+        <w:trPr>
+          <w:trHeight w:val="1603"/>
+        </w:trPr>
+        <w:tc>
+          <w:tcPr>
+            <w:tcW w:w="4042" w:type="dxa"/>
+          </w:tcPr>
+          <w:p>
+            <w:pPr>
+              <w:pBdr>
+                <w:top w:val="nil"/>
+                <w:left w:val="nil"/>
+                <w:bottom w:val="nil"/>
+                <w:right w:val="nil"/>
+                <w:between w:val="nil"/>
+              </w:pBdr>
+              <w:spacing w:before="9"/>
+              <w:ind w:left="81"/>
+              <w:rPr>
+                <w:b/>
+                <w:bCs/>
+                <w:color w:val="000000"/>
+                <w:sz w:val="20"/>
+                <w:szCs w:val="20"/>
+              </w:rPr>
+            </w:pPr>
+            <w:r>
+              <w:rPr>
+                <w:b/>
+                <w:bCs/>
+                <w:color w:val="000000"/>
+                <w:sz w:val="20"/>
+                <w:szCs w:val="20"/>
+              </w:rPr>
+              <w:t>Prioridad de desarrollo:</w:t>
+            </w:r>
+          </w:p>
+          <w:p>
+            <w:pPr>
+              <w:pBdr>
+                <w:top w:val="nil"/>
+                <w:left w:val="nil"/>
+                <w:bottom w:val="nil"/>
+                <w:right w:val="nil"/>
+                <w:between w:val="nil"/>
+              </w:pBdr>
+              <w:ind w:left="81"/>
+              <w:rPr>
+                <w:color w:val="000000"/>
+                <w:sz w:val="20"/>
+                <w:szCs w:val="20"/>
+              </w:rPr>
+            </w:pPr>
+            <w:r>
+              <w:rPr>
+                <w:color w:val="000000"/>
+                <w:sz w:val="20"/>
+                <w:szCs w:val="20"/>
+              </w:rPr>
+              <w:t>Alta</w:t>
+            </w:r>
+          </w:p>
+        </w:tc>
+        <w:tc>
+          <w:tcPr>
+            <w:tcW w:w="5620" w:type="dxa"/>
+            <w:gridSpan w:val="3"/>
+          </w:tcPr>
+          <w:p>
+            <w:pPr>
+              <w:pBdr>
+                <w:top w:val="nil"/>
+                <w:left w:val="nil"/>
+                <w:bottom w:val="nil"/>
+                <w:right w:val="nil"/>
+                <w:between w:val="nil"/>
+              </w:pBdr>
+              <w:spacing w:before="9"/>
+              <w:ind w:left="79"/>
+              <w:rPr>
+                <w:b/>
+                <w:bCs/>
+                <w:color w:val="000000"/>
+                <w:sz w:val="20"/>
+                <w:szCs w:val="20"/>
+              </w:rPr>
+            </w:pPr>
+            <w:r>
+              <w:rPr>
+                <w:b/>
+                <w:bCs/>
+                <w:color w:val="000000"/>
+                <w:sz w:val="20"/>
+                <w:szCs w:val="20"/>
+              </w:rPr>
+              <w:t>Documentos de visualización asociados:</w:t>
+            </w:r>
+          </w:p>
+          <w:p>
+            <w:pPr>
+              <w:widowControl/>
+              <w:numPr>
+                <w:ilvl w:val="0"/>
+                <w:numId w:val="9"/>
+              </w:numPr>
+              <w:pBdr>
+                <w:top w:val="nil"/>
+                <w:left w:val="nil"/>
+                <w:bottom w:val="nil"/>
+                <w:right w:val="nil"/>
+                <w:between w:val="nil"/>
+              </w:pBdr>
+              <w:ind w:hanging="360"/>
+              <w:rPr>
+                <w:color w:val="000000"/>
+                <w:sz w:val="24"/>
+                <w:szCs w:val="24"/>
+              </w:rPr>
+            </w:pPr>
+            <w:r>
+              <w:rPr>
+                <w:color w:val="000000"/>
+                <w:sz w:val="24"/>
+                <w:szCs w:val="24"/>
+              </w:rPr>
+              <w:t>Política de tratamiento de datos personales</w:t>
+            </w:r>
+          </w:p>
+          <w:p>
+            <w:pPr>
+              <w:widowControl/>
+              <w:numPr>
+                <w:ilvl w:val="0"/>
+                <w:numId w:val="9"/>
+              </w:numPr>
+              <w:pBdr>
+                <w:top w:val="nil"/>
+                <w:left w:val="nil"/>
+                <w:bottom w:val="nil"/>
+                <w:right w:val="nil"/>
+                <w:between w:val="nil"/>
+              </w:pBdr>
+              <w:ind w:hanging="360"/>
+              <w:rPr>
+                <w:color w:val="000000"/>
+                <w:sz w:val="24"/>
+                <w:szCs w:val="24"/>
+              </w:rPr>
+            </w:pPr>
+            <w:r>
+              <w:rPr>
+                <w:color w:val="000000"/>
+                <w:sz w:val="24"/>
+                <w:szCs w:val="24"/>
+              </w:rPr>
+              <w:t>Formulario de consentimiento del usuario</w:t>
+            </w:r>
+          </w:p>
+          <w:p>
+            <w:pPr>
+              <w:pBdr>
+                <w:top w:val="nil"/>
+                <w:left w:val="nil"/>
+                <w:bottom w:val="nil"/>
+                <w:right w:val="nil"/>
+                <w:between w:val="nil"/>
+              </w:pBdr>
+              <w:tabs>
+                <w:tab w:val="left" w:pos="799"/>
+              </w:tabs>
+              <w:spacing w:line="271" w:lineRule="auto"/>
+              <w:ind w:left="799"/>
+              <w:rPr>
+                <w:color w:val="000000"/>
+                <w:sz w:val="20"/>
+                <w:szCs w:val="20"/>
+              </w:rPr>
+            </w:pPr>
+          </w:p>
+        </w:tc>
+      </w:tr>
+      <w:tr>
+        <w:trPr>
+          <w:trHeight w:val="2152"/>
+        </w:trPr>
+        <w:tc>
+          <w:tcPr>
+            <w:tcW w:w="4042" w:type="dxa"/>
+          </w:tcPr>
+          <w:p>
+            <w:pPr>
+              <w:pBdr>
+                <w:top w:val="nil"/>
+                <w:left w:val="nil"/>
+                <w:bottom w:val="nil"/>
+                <w:right w:val="nil"/>
+                <w:between w:val="nil"/>
+              </w:pBdr>
+              <w:spacing w:before="9"/>
+              <w:ind w:left="81"/>
+              <w:rPr>
+                <w:b/>
+                <w:bCs/>
+                <w:color w:val="000000"/>
+                <w:sz w:val="20"/>
+                <w:szCs w:val="20"/>
+              </w:rPr>
+            </w:pPr>
+            <w:r>
+              <w:rPr>
+                <w:b/>
+                <w:bCs/>
+                <w:color w:val="000000"/>
+                <w:sz w:val="20"/>
+                <w:szCs w:val="20"/>
+              </w:rPr>
+              <w:t>Entrada:</w:t>
+            </w:r>
+          </w:p>
+          <w:p>
+            <w:pPr>
+              <w:pBdr>
+                <w:top w:val="nil"/>
+                <w:left w:val="nil"/>
+                <w:bottom w:val="nil"/>
+                <w:right w:val="nil"/>
+                <w:between w:val="nil"/>
+              </w:pBdr>
+              <w:ind w:left="110"/>
+              <w:rPr>
+                <w:color w:val="000000"/>
+                <w:sz w:val="20"/>
+                <w:szCs w:val="20"/>
+              </w:rPr>
+            </w:pPr>
+            <w:r>
+              <w:rPr>
+                <w:color w:val="000000"/>
+                <w:sz w:val="20"/>
+                <w:szCs w:val="20"/>
+              </w:rPr>
+              <w:t>Datos personales del usuario y muestras de video capturadas por la cámara.</w:t>
+            </w:r>
+          </w:p>
+        </w:tc>
+        <w:tc>
+          <w:tcPr>
+            <w:tcW w:w="5620" w:type="dxa"/>
+            <w:gridSpan w:val="3"/>
+          </w:tcPr>
+          <w:p>
+            <w:pPr>
+              <w:pBdr>
+                <w:top w:val="nil"/>
+                <w:left w:val="nil"/>
+                <w:bottom w:val="nil"/>
+                <w:right w:val="nil"/>
+                <w:between w:val="nil"/>
+              </w:pBdr>
+              <w:spacing w:before="9"/>
+              <w:ind w:left="79"/>
+              <w:rPr>
+                <w:b/>
+                <w:bCs/>
+                <w:color w:val="000000"/>
+                <w:sz w:val="20"/>
+                <w:szCs w:val="20"/>
+              </w:rPr>
+            </w:pPr>
+            <w:r>
+              <w:rPr>
+                <w:b/>
+                <w:bCs/>
+                <w:color w:val="000000"/>
+                <w:sz w:val="20"/>
+                <w:szCs w:val="20"/>
+              </w:rPr>
+              <w:t>Salida:</w:t>
+            </w:r>
+          </w:p>
+          <w:p>
+            <w:pPr>
+              <w:pBdr>
+                <w:top w:val="nil"/>
+                <w:left w:val="nil"/>
+                <w:bottom w:val="nil"/>
+                <w:right w:val="nil"/>
+                <w:between w:val="nil"/>
+              </w:pBdr>
+              <w:spacing w:before="3"/>
+              <w:ind w:left="115"/>
+              <w:rPr>
+                <w:color w:val="000000"/>
+              </w:rPr>
+            </w:pPr>
+            <w:r>
+              <w:rPr>
+                <w:color w:val="000000"/>
+                <w:sz w:val="20"/>
+                <w:szCs w:val="20"/>
+              </w:rPr>
+              <w:t>Tratamiento de datos conforme a la normativa vigente.</w:t>
+            </w:r>
+          </w:p>
+        </w:tc>
+      </w:tr>
+      <w:tr>
+        <w:trPr>
+          <w:trHeight w:val="1944"/>
+        </w:trPr>
+        <w:tc>
+          <w:tcPr>
+            <w:tcW w:w="9662" w:type="dxa"/>
+            <w:gridSpan w:val="4"/>
+          </w:tcPr>
+          <w:p>
+            <w:pPr>
+              <w:pBdr>
+                <w:top w:val="nil"/>
+                <w:left w:val="nil"/>
+                <w:bottom w:val="nil"/>
+                <w:right w:val="nil"/>
+                <w:between w:val="nil"/>
+              </w:pBdr>
+              <w:spacing w:before="11"/>
+              <w:ind w:left="81"/>
+              <w:rPr>
+                <w:b/>
+                <w:bCs/>
+                <w:color w:val="000000"/>
+                <w:sz w:val="20"/>
+                <w:szCs w:val="20"/>
+              </w:rPr>
+            </w:pPr>
+            <w:r>
+              <w:rPr>
+                <w:b/>
+                <w:bCs/>
+                <w:color w:val="000000"/>
+                <w:sz w:val="20"/>
+                <w:szCs w:val="20"/>
+              </w:rPr>
+              <w:t>Descripción:</w:t>
+            </w:r>
+          </w:p>
+          <w:p>
+            <w:pPr>
+              <w:pBdr>
+                <w:top w:val="nil"/>
+                <w:left w:val="nil"/>
+                <w:bottom w:val="nil"/>
+                <w:right w:val="nil"/>
+                <w:between w:val="nil"/>
+              </w:pBdr>
+              <w:spacing w:before="13"/>
+              <w:rPr>
+                <w:color w:val="000000"/>
+                <w:sz w:val="20"/>
+                <w:szCs w:val="20"/>
+              </w:rPr>
+            </w:pPr>
+          </w:p>
+          <w:p>
+            <w:pPr>
+              <w:numPr>
+                <w:ilvl w:val="0"/>
+                <w:numId w:val="8"/>
+              </w:numPr>
+              <w:pBdr>
+                <w:top w:val="nil"/>
+                <w:left w:val="nil"/>
+                <w:bottom w:val="nil"/>
+                <w:right w:val="nil"/>
+                <w:between w:val="nil"/>
+              </w:pBdr>
+              <w:tabs>
+                <w:tab w:val="left" w:pos="830"/>
+              </w:tabs>
+              <w:ind w:right="103"/>
+              <w:jc w:val="both"/>
+              <w:rPr>
+                <w:color w:val="000000"/>
+                <w:sz w:val="20"/>
+                <w:szCs w:val="20"/>
+              </w:rPr>
+            </w:pPr>
+            <w:r>
+              <w:rPr>
+                <w:color w:val="000000"/>
+                <w:sz w:val="20"/>
+                <w:szCs w:val="20"/>
+              </w:rPr>
+              <w:t>El sistema deberá tratar los datos personales conforme a la Ley 1581 de 2012 y el Decreto 1377 de 2013. El usuario deberá otorgar autorización expresa antes de que cualquier muestra de video o de gestos sea almacenada con fines de entrenamiento del modelo, y deberá poder revocarla y solicitar la supresión de sus datos.</w:t>
+            </w:r>
+          </w:p>
+        </w:tc>
+      </w:tr>
+      <w:tr>
+        <w:trPr>
+          <w:trHeight w:val="1729"/>
+        </w:trPr>
+        <w:tc>
+          <w:tcPr>
+            <w:tcW w:w="9662" w:type="dxa"/>
+            <w:gridSpan w:val="4"/>
+          </w:tcPr>
+          <w:p>
+            <w:pPr>
+              <w:pBdr>
+                <w:top w:val="nil"/>
+                <w:left w:val="nil"/>
+                <w:bottom w:val="nil"/>
+                <w:right w:val="nil"/>
+                <w:between w:val="nil"/>
+              </w:pBdr>
+              <w:spacing w:before="9"/>
+              <w:ind w:left="81"/>
+              <w:rPr>
+                <w:b/>
+                <w:bCs/>
+                <w:color w:val="000000"/>
+                <w:sz w:val="20"/>
+                <w:szCs w:val="20"/>
+              </w:rPr>
+            </w:pPr>
+            <w:r>
+              <w:rPr>
+                <w:b/>
+                <w:bCs/>
+                <w:color w:val="000000"/>
+                <w:sz w:val="20"/>
+                <w:szCs w:val="20"/>
+              </w:rPr>
+              <w:t>Manejo de situaciones anormales:</w:t>
+            </w:r>
+          </w:p>
+          <w:p>
+            <w:pPr>
+              <w:pBdr>
+                <w:top w:val="nil"/>
+                <w:left w:val="nil"/>
+                <w:bottom w:val="nil"/>
+                <w:right w:val="nil"/>
+                <w:between w:val="nil"/>
+              </w:pBdr>
+              <w:spacing w:before="9"/>
+              <w:ind w:left="81"/>
+              <w:rPr>
+                <w:b/>
+                <w:bCs/>
+                <w:color w:val="000000"/>
+                <w:sz w:val="20"/>
+                <w:szCs w:val="20"/>
+              </w:rPr>
+            </w:pPr>
+          </w:p>
+          <w:p>
+            <w:pPr>
+              <w:pBdr>
+                <w:top w:val="nil"/>
+                <w:left w:val="nil"/>
+                <w:bottom w:val="nil"/>
+                <w:right w:val="nil"/>
+                <w:between w:val="nil"/>
+              </w:pBdr>
+              <w:tabs>
+                <w:tab w:val="left" w:pos="801"/>
+              </w:tabs>
+              <w:spacing w:before="19" w:line="230" w:lineRule="auto"/>
+              <w:ind w:left="801" w:right="79"/>
+              <w:rPr>
+                <w:color w:val="000000"/>
+                <w:sz w:val="20"/>
+                <w:szCs w:val="20"/>
+              </w:rPr>
+            </w:pPr>
+            <w:r>
+              <w:rPr>
+                <w:color w:val="000000"/>
+                <w:sz w:val="20"/>
+                <w:szCs w:val="20"/>
+              </w:rPr>
+              <w:t>Si el usuario no otorga o revoca la autorización, el sistema deberá continuar operando sin almacenar muestras, conservando la funcionalidad de traducción.</w:t>
+            </w:r>
+          </w:p>
+        </w:tc>
+      </w:tr>
+      <w:tr>
+        <w:trPr>
+          <w:trHeight w:val="1963"/>
+        </w:trPr>
+        <w:tc>
+          <w:tcPr>
+            <w:tcW w:w="9662" w:type="dxa"/>
+            <w:gridSpan w:val="4"/>
+          </w:tcPr>
+          <w:p>
+            <w:pPr>
+              <w:pBdr>
+                <w:top w:val="nil"/>
+                <w:left w:val="nil"/>
+                <w:bottom w:val="nil"/>
+                <w:right w:val="nil"/>
+                <w:between w:val="nil"/>
+              </w:pBdr>
+              <w:spacing w:before="11"/>
+              <w:ind w:left="81"/>
+              <w:rPr>
+                <w:b/>
+                <w:bCs/>
+                <w:color w:val="000000"/>
+                <w:sz w:val="20"/>
+                <w:szCs w:val="20"/>
+              </w:rPr>
+            </w:pPr>
+            <w:r>
+              <w:rPr>
+                <w:b/>
+                <w:bCs/>
+                <w:color w:val="000000"/>
+                <w:sz w:val="20"/>
+                <w:szCs w:val="20"/>
+              </w:rPr>
+              <w:t>Criterios de aceptación:</w:t>
+            </w:r>
+          </w:p>
+          <w:p>
+            <w:pPr>
+              <w:pBdr>
+                <w:top w:val="nil"/>
+                <w:left w:val="nil"/>
+                <w:bottom w:val="nil"/>
+                <w:right w:val="nil"/>
+                <w:between w:val="nil"/>
+              </w:pBdr>
+              <w:spacing w:before="11"/>
+              <w:ind w:left="81"/>
+              <w:rPr>
+                <w:b/>
+                <w:bCs/>
+                <w:color w:val="000000"/>
+                <w:sz w:val="20"/>
+                <w:szCs w:val="20"/>
+              </w:rPr>
+            </w:pPr>
+          </w:p>
+          <w:p>
+            <w:pPr>
+              <w:pBdr>
+                <w:top w:val="nil"/>
+                <w:left w:val="nil"/>
+                <w:bottom w:val="nil"/>
+                <w:right w:val="nil"/>
+                <w:between w:val="nil"/>
+              </w:pBdr>
+              <w:tabs>
+                <w:tab w:val="left" w:pos="830"/>
+              </w:tabs>
+              <w:spacing w:before="20" w:line="230" w:lineRule="auto"/>
+              <w:ind w:left="830" w:right="411"/>
+              <w:rPr>
+                <w:color w:val="000000"/>
+                <w:sz w:val="20"/>
+                <w:szCs w:val="20"/>
+              </w:rPr>
+            </w:pPr>
+            <w:r>
+              <w:rPr>
+                <w:color w:val="000000"/>
+                <w:sz w:val="24"/>
+                <w:szCs w:val="24"/>
+              </w:rPr>
+              <w:t>La autorización debe registrarse con fecha y hora y ser demostrable.</w:t>
+            </w:r>
+          </w:p>
+          <w:p>
+            <w:pPr>
+              <w:pBdr>
+                <w:top w:val="nil"/>
+                <w:left w:val="nil"/>
+                <w:bottom w:val="nil"/>
+                <w:right w:val="nil"/>
+                <w:between w:val="nil"/>
+              </w:pBdr>
+              <w:tabs>
+                <w:tab w:val="left" w:pos="830"/>
+              </w:tabs>
+              <w:spacing w:before="20" w:line="230" w:lineRule="auto"/>
+              <w:ind w:left="830" w:right="411"/>
+              <w:rPr>
+                <w:color w:val="000000"/>
+                <w:sz w:val="20"/>
+                <w:szCs w:val="20"/>
+              </w:rPr>
+            </w:pPr>
+            <w:r>
+              <w:rPr>
+                <w:color w:val="000000"/>
+                <w:sz w:val="24"/>
+                <w:szCs w:val="24"/>
+              </w:rPr>
+              <w:t>El usuario debe poder solicitar la eliminación de su cuenta y de sus datos asociados.</w:t>
+            </w:r>
+          </w:p>
+          <w:p>
+            <w:pPr>
+              <w:pBdr>
+                <w:top w:val="nil"/>
+                <w:left w:val="nil"/>
+                <w:bottom w:val="nil"/>
+                <w:right w:val="nil"/>
+                <w:between w:val="nil"/>
+              </w:pBdr>
+              <w:tabs>
+                <w:tab w:val="left" w:pos="830"/>
+              </w:tabs>
+              <w:spacing w:before="20" w:line="230" w:lineRule="auto"/>
+              <w:ind w:left="830" w:right="411"/>
+              <w:rPr>
+                <w:color w:val="000000"/>
+                <w:sz w:val="20"/>
+                <w:szCs w:val="20"/>
+              </w:rPr>
+            </w:pPr>
+            <w:r>
+              <w:rPr>
+                <w:color w:val="000000"/>
+                <w:sz w:val="24"/>
+                <w:szCs w:val="24"/>
+              </w:rPr>
+              <w:t>Las muestras conservadas para entrenamiento deben quedar desvinculadas de la identidad del usuario.</w:t>
             </w:r>
           </w:p>
         </w:tc>

</xml_diff>